<commit_message>
Transmittal letter: tighten spacing and margins to fit one page
Co-Authored-By: Claude Opus 5.5 <noreply@anthropic.com>
Claude-Session: https://claude.ai/code/session_01X474181YGTsF16kamYY3c3
</commit_message>
<xml_diff>
--- a/docs/pre-implementation/Afronovation_Transmittal_Letter_ZIDA_CEO_Discovery_Questionnaire.docx
+++ b/docs/pre-implementation/Afronovation_Transmittal_Letter_ZIDA_CEO_Discovery_Questionnaire.docx
@@ -4,7 +4,7 @@
   <w:body>
     <w:p>
       <w:pPr>
-        <w:spacing w:after="240"/>
+        <w:spacing w:after="160"/>
       </w:pPr>
       <w:r>
         <w:rPr>
@@ -71,7 +71,7 @@
     </w:p>
     <w:p>
       <w:pPr>
-        <w:spacing w:after="240"/>
+        <w:spacing w:after="160"/>
       </w:pPr>
       <w:r>
         <w:rPr>
@@ -84,7 +84,7 @@
     </w:p>
     <w:p>
       <w:pPr>
-        <w:spacing w:after="140" w:line="264"/>
+        <w:spacing w:after="100" w:line="259"/>
       </w:pPr>
       <w:r>
         <w:rPr>
@@ -99,7 +99,7 @@
     </w:p>
     <w:p>
       <w:pPr>
-        <w:spacing w:after="140" w:line="264"/>
+        <w:spacing w:after="100" w:line="259"/>
       </w:pPr>
       <w:r>
         <w:rPr>
@@ -112,7 +112,7 @@
     </w:p>
     <w:p>
       <w:pPr>
-        <w:spacing w:after="140" w:line="264"/>
+        <w:spacing w:after="100" w:line="259"/>
       </w:pPr>
       <w:r>
         <w:rPr>
@@ -125,7 +125,7 @@
     </w:p>
     <w:p>
       <w:pPr>
-        <w:spacing w:after="140" w:line="264"/>
+        <w:spacing w:after="100" w:line="259"/>
       </w:pPr>
       <w:r>
         <w:rPr>
@@ -143,7 +143,7 @@
           <w:ilvl w:val="0"/>
           <w:numId w:val="2"/>
         </w:numPr>
-        <w:spacing w:after="60" w:line="264"/>
+        <w:spacing w:after="40" w:line="259"/>
       </w:pPr>
       <w:r>
         <w:rPr>
@@ -171,7 +171,7 @@
           <w:ilvl w:val="0"/>
           <w:numId w:val="2"/>
         </w:numPr>
-        <w:spacing w:after="60" w:line="264"/>
+        <w:spacing w:after="40" w:line="259"/>
       </w:pPr>
       <w:r>
         <w:rPr>
@@ -199,7 +199,7 @@
           <w:ilvl w:val="0"/>
           <w:numId w:val="2"/>
         </w:numPr>
-        <w:spacing w:after="60" w:line="264"/>
+        <w:spacing w:after="40" w:line="259"/>
       </w:pPr>
       <w:r>
         <w:rPr>
@@ -227,7 +227,7 @@
           <w:ilvl w:val="0"/>
           <w:numId w:val="2"/>
         </w:numPr>
-        <w:spacing w:after="60" w:line="264"/>
+        <w:spacing w:after="40" w:line="259"/>
       </w:pPr>
       <w:r>
         <w:rPr>
@@ -250,7 +250,7 @@
     </w:p>
     <w:p>
       <w:pPr>
-        <w:spacing w:after="140" w:before="80" w:line="264"/>
+        <w:spacing w:after="100" w:before="60" w:line="259"/>
       </w:pPr>
       <w:r>
         <w:rPr>
@@ -263,7 +263,7 @@
     </w:p>
     <w:p>
       <w:pPr>
-        <w:spacing w:after="140" w:line="264"/>
+        <w:spacing w:after="100" w:line="259"/>
       </w:pPr>
       <w:r>
         <w:rPr>
@@ -276,7 +276,7 @@
     </w:p>
     <w:p>
       <w:pPr>
-        <w:spacing w:after="140" w:line="264"/>
+        <w:spacing w:after="100" w:line="259"/>
       </w:pPr>
       <w:r>
         <w:rPr>
@@ -289,7 +289,7 @@
     </w:p>
     <w:p>
       <w:pPr>
-        <w:spacing w:after="700"/>
+        <w:spacing w:after="560"/>
       </w:pPr>
       <w:r>
         <w:rPr>
@@ -330,7 +330,7 @@
     </w:p>
     <w:p>
       <w:pPr>
-        <w:spacing w:after="200"/>
+        <w:spacing w:after="140"/>
       </w:pPr>
       <w:r>
         <w:rPr>
@@ -388,7 +388,7 @@
       <w:headerReference w:type="default" r:id="rId6"/>
       <w:footerReference w:type="default" r:id="rId7"/>
       <w:pgSz w:w="12240" w:h="15840" w:orient="portrait"/>
-      <w:pgMar w:top="1900" w:right="1440" w:bottom="1300" w:left="1440" w:header="600" w:footer="600" w:gutter="0"/>
+      <w:pgMar w:top="1600" w:right="1440" w:bottom="1100" w:left="1440" w:header="500" w:footer="450" w:gutter="0"/>
       <w:pgNumType/>
       <w:docGrid w:linePitch="360"/>
     </w:sectPr>

</xml_diff>

<commit_message>
Date questionnaire and letter 8 October 2026; responses due 15 October 2026
Co-Authored-By: Claude Opus 5.5 <noreply@anthropic.com>
Claude-Session: https://claude.ai/code/session_01X474181YGTsF16kamYY3c3
</commit_message>
<xml_diff>
--- a/docs/pre-implementation/Afronovation_Transmittal_Letter_ZIDA_CEO_Discovery_Questionnaire.docx
+++ b/docs/pre-implementation/Afronovation_Transmittal_Letter_ZIDA_CEO_Discovery_Questionnaire.docx
@@ -12,7 +12,7 @@
           <w:sz w:val="21"/>
           <w:szCs w:val="21"/>
         </w:rPr>
-        <w:t xml:space="preserve">30 September 2026</w:t>
+        <w:t xml:space="preserve">8 October 2026</w:t>
       </w:r>
     </w:p>
     <w:p>
@@ -258,7 +258,7 @@
           <w:sz w:val="21"/>
           <w:szCs w:val="21"/>
         </w:rPr>
-        <w:t xml:space="preserve">Your responses will allow Afronovation to present costed acquisition options that fit Government’s procurement framework and build lasting local capability. We respectfully propose a 90-minute technical workshop with ZIDA’s ICT and security leads, at your convenience, to review the responses together.</w:t>
+        <w:t xml:space="preserve">Your responses will allow Afronovation to present costed acquisition options that fit Government’s procurement framework and build lasting local capability. We would be grateful to receive your responses by 15 October 2026, and respectfully propose a 90-minute technical workshop with ZIDA’s ICT and security leads, at your convenience, to review the responses together.</w:t>
       </w:r>
     </w:p>
     <w:p>

</xml_diff>